<commit_message>
Rework portfolio and EKS migration POC
</commit_message>
<xml_diff>
--- a/project-pocs/downloads/02-smart-building-cicd-modernization-poc.docx
+++ b/project-pocs/downloads/02-smart-building-cicd-modernization-poc.docx
@@ -26,12 +26,6 @@
         <w:t xml:space="preserve">Public-safe project name: Smart Building Management Platform  </w:t>
       </w:r>
     </w:p>
-    <w:p>
-      <w:r>
-        <w:t xml:space="preserve">Document type: Naukri-ready work sample / portfolio POC</w:t>
-      </w:r>
-    </w:p>
-    <w:p/>
     <w:p>
       <w:pPr>
         <w:pStyle w:val="Heading2"/>

</xml_diff>